<commit_message>
Maak vlaggenweer staand en als PDF downloadbaar
</commit_message>
<xml_diff>
--- a/VLAGGENWEER.docx
+++ b/VLAGGENWEER.docx
@@ -4,13 +4,12 @@
   <w:body>
     <w:p>
       <w:pPr>
-        <w:spacing w:before="0" w:after="0" w:line="20" w:lineRule="exact"/>
         <w:jc w:val="center"/>
       </w:pPr>
       <w:r>
         <w:drawing>
           <wp:inline xmlns:a="http://schemas.openxmlformats.org/drawingml/2006/main" xmlns:pic="http://schemas.openxmlformats.org/drawingml/2006/picture">
-            <wp:extent cx="10332720" cy="7304774"/>
+            <wp:extent cx="684000" cy="684000"/>
             <wp:docPr id="1" name="Picture 1"/>
             <wp:cNvGraphicFramePr>
               <a:graphicFrameLocks noChangeAspect="1"/>
@@ -19,7 +18,7 @@
               <a:graphicData uri="http://schemas.openxmlformats.org/drawingml/2006/picture">
                 <pic:pic>
                   <pic:nvPicPr>
-                    <pic:cNvPr id="0" name="vlaggenweer_paginalayout.png"/>
+                    <pic:cNvPr id="0" name="vlag_illustratie.png"/>
                     <pic:cNvPicPr/>
                   </pic:nvPicPr>
                   <pic:blipFill>
@@ -31,7 +30,7 @@
                   <pic:spPr>
                     <a:xfrm>
                       <a:off x="0" y="0"/>
-                      <a:ext cx="10332720" cy="7304774"/>
+                      <a:ext cx="684000" cy="684000"/>
                     </a:xfrm>
                     <a:prstGeom prst="rect"/>
                   </pic:spPr>
@@ -42,14 +41,1330 @@
         </w:drawing>
       </w:r>
     </w:p>
+    <w:p>
+      <w:pPr>
+        <w:spacing w:after="0"/>
+        <w:jc w:val="center"/>
+      </w:pPr>
+      <w:r>
+        <w:rPr>
+          <w:b/>
+          <w:color w:val="003366"/>
+          <w:sz w:val="52"/>
+        </w:rPr>
+        <w:t>VLAGGENWEER</w:t>
+      </w:r>
+    </w:p>
+    <w:p>
+      <w:pPr>
+        <w:spacing w:after="0"/>
+        <w:jc w:val="center"/>
+      </w:pPr>
+      <w:r>
+        <w:rPr>
+          <w:b w:val="0"/>
+          <w:color w:val="334155"/>
+          <w:sz w:val="22"/>
+        </w:rPr>
+        <w:t>Rotterdam | ochtend, middag en avond</w:t>
+      </w:r>
+    </w:p>
+    <w:p>
+      <w:pPr>
+        <w:spacing w:after="160"/>
+        <w:jc w:val="center"/>
+      </w:pPr>
+      <w:r>
+        <w:rPr>
+          <w:b/>
+          <w:color w:val="003366"/>
+          <w:sz w:val="20"/>
+        </w:rPr>
+        <w:t>Maandag 27 april 2026 | 07:16 uur</w:t>
+      </w:r>
+    </w:p>
+    <w:tbl>
+      <w:tblPr>
+        <w:tblW w:type="auto" w:w="0"/>
+        <w:tblLook w:firstColumn="1" w:firstRow="1" w:lastColumn="0" w:lastRow="0" w:noHBand="0" w:noVBand="1" w:val="04A0"/>
+      </w:tblPr>
+      <w:tblGrid>
+        <w:gridCol w:w="11332"/>
+      </w:tblGrid>
+      <w:tr>
+        <w:tc>
+          <w:tcPr>
+            <w:tcW w:type="dxa" w:w="11332"/>
+            <w:shd w:fill="F8FBFF"/>
+            <w:tcBorders>
+              <w:top w:val="single" w:sz="8" w:space="0" w:color="D8E2EE"/>
+              <w:left w:val="single" w:sz="8" w:space="0" w:color="D8E2EE"/>
+              <w:bottom w:val="single" w:sz="8" w:space="0" w:color="D8E2EE"/>
+              <w:right w:val="single" w:sz="8" w:space="0" w:color="D8E2EE"/>
+            </w:tcBorders>
+            <w:tcMar>
+              <w:top w:w="150" w:type="dxa"/>
+              <w:start w:w="180" w:type="dxa"/>
+              <w:bottom w:w="150" w:type="dxa"/>
+              <w:end w:w="180" w:type="dxa"/>
+            </w:tcMar>
+          </w:tcPr>
+          <w:p>
+            <w:r>
+              <w:rPr>
+                <w:b/>
+                <w:color w:val="003366"/>
+                <w:sz w:val="28"/>
+              </w:rPr>
+              <w:t>NOORDOOSTENWIND</w:t>
+            </w:r>
+          </w:p>
+          <w:p>
+            <w:pPr>
+              <w:spacing w:before="80"/>
+            </w:pPr>
+            <w:r>
+              <w:rPr>
+                <w:b w:val="0"/>
+                <w:color w:val="1F334A"/>
+                <w:sz w:val="19"/>
+              </w:rPr>
+              <w:t>Een hogedrukgebied ligt boven de Duitse Bocht. Een zwakke storing ligt momenteel boven de Britse Eilanden en komt langzaam dichterbij. Morgen krijgen we te maken met een hogedrukgebied nabij Schotland. Het verplaatst zich richting de Noordzee, waar het op woensdag aankomt. Dit zal bij ons zorgen voor fraai lenteweer.</w:t>
+            </w:r>
+          </w:p>
+        </w:tc>
+      </w:tr>
+    </w:tbl>
+    <w:p>
+      <w:pPr>
+        <w:spacing w:after="40"/>
+      </w:pPr>
+    </w:p>
+    <w:tbl>
+      <w:tblPr>
+        <w:tblW w:type="auto" w:w="0"/>
+        <w:tblLayout w:type="autofit"/>
+        <w:tblLook w:firstColumn="1" w:firstRow="1" w:lastColumn="0" w:lastRow="0" w:noHBand="0" w:noVBand="1" w:val="04A0"/>
+      </w:tblPr>
+      <w:tblGrid>
+        <w:gridCol w:w="2833"/>
+        <w:gridCol w:w="2833"/>
+        <w:gridCol w:w="2833"/>
+        <w:gridCol w:w="2833"/>
+      </w:tblGrid>
+      <w:tr>
+        <w:tc>
+          <w:tcPr>
+            <w:tcW w:type="dxa" w:w="2833"/>
+            <w:shd w:fill="003366"/>
+            <w:tcBorders>
+              <w:top w:val="single" w:sz="8" w:space="0" w:color="003366"/>
+              <w:left w:val="single" w:sz="8" w:space="0" w:color="003366"/>
+              <w:bottom w:val="single" w:sz="8" w:space="0" w:color="003366"/>
+              <w:right w:val="single" w:sz="8" w:space="0" w:color="003366"/>
+            </w:tcBorders>
+            <w:tcMar>
+              <w:top w:w="110" w:type="dxa"/>
+              <w:start w:w="110" w:type="dxa"/>
+              <w:bottom w:w="110" w:type="dxa"/>
+              <w:end w:w="110" w:type="dxa"/>
+            </w:tcMar>
+          </w:tcPr>
+          <w:p>
+            <w:r>
+              <w:rPr>
+                <w:b/>
+                <w:color w:val="FFFFFF"/>
+                <w:sz w:val="19"/>
+              </w:rPr>
+              <w:t>Dag</w:t>
+            </w:r>
+          </w:p>
+        </w:tc>
+        <w:tc>
+          <w:tcPr>
+            <w:tcW w:type="dxa" w:w="2833"/>
+            <w:shd w:fill="003366"/>
+            <w:tcBorders>
+              <w:top w:val="single" w:sz="8" w:space="0" w:color="003366"/>
+              <w:left w:val="single" w:sz="8" w:space="0" w:color="003366"/>
+              <w:bottom w:val="single" w:sz="8" w:space="0" w:color="003366"/>
+              <w:right w:val="single" w:sz="8" w:space="0" w:color="003366"/>
+            </w:tcBorders>
+            <w:tcMar>
+              <w:top w:w="110" w:type="dxa"/>
+              <w:start w:w="110" w:type="dxa"/>
+              <w:bottom w:w="110" w:type="dxa"/>
+              <w:end w:w="110" w:type="dxa"/>
+            </w:tcMar>
+          </w:tcPr>
+          <w:p>
+            <w:r>
+              <w:rPr>
+                <w:b/>
+                <w:color w:val="FFFFFF"/>
+                <w:sz w:val="19"/>
+              </w:rPr>
+              <w:t>Ochtend 09:00</w:t>
+            </w:r>
+          </w:p>
+        </w:tc>
+        <w:tc>
+          <w:tcPr>
+            <w:tcW w:type="dxa" w:w="2833"/>
+            <w:shd w:fill="003366"/>
+            <w:tcBorders>
+              <w:top w:val="single" w:sz="8" w:space="0" w:color="003366"/>
+              <w:left w:val="single" w:sz="8" w:space="0" w:color="003366"/>
+              <w:bottom w:val="single" w:sz="8" w:space="0" w:color="003366"/>
+              <w:right w:val="single" w:sz="8" w:space="0" w:color="003366"/>
+            </w:tcBorders>
+            <w:tcMar>
+              <w:top w:w="110" w:type="dxa"/>
+              <w:start w:w="110" w:type="dxa"/>
+              <w:bottom w:w="110" w:type="dxa"/>
+              <w:end w:w="110" w:type="dxa"/>
+            </w:tcMar>
+          </w:tcPr>
+          <w:p>
+            <w:r>
+              <w:rPr>
+                <w:b/>
+                <w:color w:val="FFFFFF"/>
+                <w:sz w:val="19"/>
+              </w:rPr>
+              <w:t>Middag 15:00</w:t>
+            </w:r>
+          </w:p>
+        </w:tc>
+        <w:tc>
+          <w:tcPr>
+            <w:tcW w:type="dxa" w:w="2833"/>
+            <w:shd w:fill="003366"/>
+            <w:tcBorders>
+              <w:top w:val="single" w:sz="8" w:space="0" w:color="003366"/>
+              <w:left w:val="single" w:sz="8" w:space="0" w:color="003366"/>
+              <w:bottom w:val="single" w:sz="8" w:space="0" w:color="003366"/>
+              <w:right w:val="single" w:sz="8" w:space="0" w:color="003366"/>
+            </w:tcBorders>
+            <w:tcMar>
+              <w:top w:w="110" w:type="dxa"/>
+              <w:start w:w="110" w:type="dxa"/>
+              <w:bottom w:w="110" w:type="dxa"/>
+              <w:end w:w="110" w:type="dxa"/>
+            </w:tcMar>
+          </w:tcPr>
+          <w:p>
+            <w:r>
+              <w:rPr>
+                <w:b/>
+                <w:color w:val="FFFFFF"/>
+                <w:sz w:val="19"/>
+              </w:rPr>
+              <w:t>Avond 21:00</w:t>
+            </w:r>
+          </w:p>
+        </w:tc>
+      </w:tr>
+      <w:tr>
+        <w:tc>
+          <w:tcPr>
+            <w:tcW w:type="dxa" w:w="2833"/>
+            <w:shd w:fill="EAF3FF"/>
+            <w:tcBorders>
+              <w:top w:val="single" w:sz="6" w:space="0" w:color="D6DEE8"/>
+              <w:left w:val="single" w:sz="6" w:space="0" w:color="D6DEE8"/>
+              <w:bottom w:val="single" w:sz="6" w:space="0" w:color="D6DEE8"/>
+              <w:right w:val="single" w:sz="6" w:space="0" w:color="D6DEE8"/>
+            </w:tcBorders>
+            <w:tcMar>
+              <w:top w:w="150" w:type="dxa"/>
+              <w:start w:w="120" w:type="dxa"/>
+              <w:bottom w:w="150" w:type="dxa"/>
+              <w:end w:w="120" w:type="dxa"/>
+            </w:tcMar>
+          </w:tcPr>
+          <w:p>
+            <w:r>
+              <w:rPr>
+                <w:b/>
+                <w:color w:val="003366"/>
+                <w:sz w:val="21"/>
+              </w:rPr>
+              <w:t>Maandag</w:t>
+            </w:r>
+          </w:p>
+          <w:p>
+            <w:r>
+              <w:rPr>
+                <w:b w:val="0"/>
+                <w:color w:val="475569"/>
+                <w:sz w:val="18"/>
+              </w:rPr>
+              <w:t>27 april</w:t>
+            </w:r>
+          </w:p>
+        </w:tc>
+        <w:tc>
+          <w:tcPr>
+            <w:tcW w:type="dxa" w:w="2833"/>
+            <w:shd w:fill="16A34A"/>
+            <w:tcBorders>
+              <w:top w:val="single" w:sz="8" w:space="0" w:color="D6DEE8"/>
+              <w:left w:val="single" w:sz="8" w:space="0" w:color="D6DEE8"/>
+              <w:bottom w:val="single" w:sz="8" w:space="0" w:color="D6DEE8"/>
+              <w:right w:val="single" w:sz="8" w:space="0" w:color="D6DEE8"/>
+            </w:tcBorders>
+            <w:tcMar>
+              <w:top w:w="150" w:type="dxa"/>
+              <w:start w:w="120" w:type="dxa"/>
+              <w:bottom w:w="150" w:type="dxa"/>
+              <w:end w:w="120" w:type="dxa"/>
+            </w:tcMar>
+          </w:tcPr>
+          <w:p>
+            <w:r>
+              <w:rPr>
+                <w:b/>
+                <w:color w:val="FFFFFF"/>
+                <w:sz w:val="30"/>
+              </w:rPr>
+              <w:t>↗  ONO</w:t>
+            </w:r>
+          </w:p>
+          <w:p>
+            <w:r>
+              <w:rPr>
+                <w:b/>
+                <w:color w:val="FFFFFF"/>
+                <w:sz w:val="26"/>
+              </w:rPr>
+              <w:t>Bft 2</w:t>
+            </w:r>
+          </w:p>
+          <w:p>
+            <w:r>
+              <w:rPr>
+                <w:b w:val="0"/>
+                <w:color w:val="FFFFFF"/>
+                <w:sz w:val="19"/>
+              </w:rPr>
+              <w:t>9 km/u wind</w:t>
+            </w:r>
+          </w:p>
+          <w:p>
+            <w:r>
+              <w:rPr>
+                <w:b w:val="0"/>
+                <w:color w:val="FFFFFF"/>
+                <w:sz w:val="19"/>
+              </w:rPr>
+              <w:t>stoten 15 km/u</w:t>
+            </w:r>
+          </w:p>
+        </w:tc>
+        <w:tc>
+          <w:tcPr>
+            <w:tcW w:type="dxa" w:w="2833"/>
+            <w:shd w:fill="16A34A"/>
+            <w:tcBorders>
+              <w:top w:val="single" w:sz="8" w:space="0" w:color="D6DEE8"/>
+              <w:left w:val="single" w:sz="8" w:space="0" w:color="D6DEE8"/>
+              <w:bottom w:val="single" w:sz="8" w:space="0" w:color="D6DEE8"/>
+              <w:right w:val="single" w:sz="8" w:space="0" w:color="D6DEE8"/>
+            </w:tcBorders>
+            <w:tcMar>
+              <w:top w:w="150" w:type="dxa"/>
+              <w:start w:w="120" w:type="dxa"/>
+              <w:bottom w:w="150" w:type="dxa"/>
+              <w:end w:w="120" w:type="dxa"/>
+            </w:tcMar>
+          </w:tcPr>
+          <w:p>
+            <w:r>
+              <w:rPr>
+                <w:b/>
+                <w:color w:val="FFFFFF"/>
+                <w:sz w:val="30"/>
+              </w:rPr>
+              <w:t>↗  NO</w:t>
+            </w:r>
+          </w:p>
+          <w:p>
+            <w:r>
+              <w:rPr>
+                <w:b/>
+                <w:color w:val="FFFFFF"/>
+                <w:sz w:val="26"/>
+              </w:rPr>
+              <w:t>Bft 2</w:t>
+            </w:r>
+          </w:p>
+          <w:p>
+            <w:r>
+              <w:rPr>
+                <w:b w:val="0"/>
+                <w:color w:val="FFFFFF"/>
+                <w:sz w:val="19"/>
+              </w:rPr>
+              <w:t>11 km/u wind</w:t>
+            </w:r>
+          </w:p>
+          <w:p>
+            <w:r>
+              <w:rPr>
+                <w:b w:val="0"/>
+                <w:color w:val="FFFFFF"/>
+                <w:sz w:val="19"/>
+              </w:rPr>
+              <w:t>stoten 20 km/u</w:t>
+            </w:r>
+          </w:p>
+        </w:tc>
+        <w:tc>
+          <w:tcPr>
+            <w:tcW w:type="dxa" w:w="2833"/>
+            <w:shd w:fill="16A34A"/>
+            <w:tcBorders>
+              <w:top w:val="single" w:sz="8" w:space="0" w:color="D6DEE8"/>
+              <w:left w:val="single" w:sz="8" w:space="0" w:color="D6DEE8"/>
+              <w:bottom w:val="single" w:sz="8" w:space="0" w:color="D6DEE8"/>
+              <w:right w:val="single" w:sz="8" w:space="0" w:color="D6DEE8"/>
+            </w:tcBorders>
+            <w:tcMar>
+              <w:top w:w="150" w:type="dxa"/>
+              <w:start w:w="120" w:type="dxa"/>
+              <w:bottom w:w="150" w:type="dxa"/>
+              <w:end w:w="120" w:type="dxa"/>
+            </w:tcMar>
+          </w:tcPr>
+          <w:p>
+            <w:r>
+              <w:rPr>
+                <w:b/>
+                <w:color w:val="FFFFFF"/>
+                <w:sz w:val="30"/>
+              </w:rPr>
+              <w:t>↗  NO</w:t>
+            </w:r>
+          </w:p>
+          <w:p>
+            <w:r>
+              <w:rPr>
+                <w:b/>
+                <w:color w:val="FFFFFF"/>
+                <w:sz w:val="26"/>
+              </w:rPr>
+              <w:t>Bft 3</w:t>
+            </w:r>
+          </w:p>
+          <w:p>
+            <w:r>
+              <w:rPr>
+                <w:b w:val="0"/>
+                <w:color w:val="FFFFFF"/>
+                <w:sz w:val="19"/>
+              </w:rPr>
+              <w:t>13 km/u wind</w:t>
+            </w:r>
+          </w:p>
+          <w:p>
+            <w:r>
+              <w:rPr>
+                <w:b w:val="0"/>
+                <w:color w:val="FFFFFF"/>
+                <w:sz w:val="19"/>
+              </w:rPr>
+              <w:t>stoten 22 km/u</w:t>
+            </w:r>
+          </w:p>
+        </w:tc>
+      </w:tr>
+      <w:tr>
+        <w:tc>
+          <w:tcPr>
+            <w:tcW w:type="dxa" w:w="2833"/>
+            <w:shd w:fill="F8FBFF"/>
+            <w:tcBorders>
+              <w:top w:val="single" w:sz="6" w:space="0" w:color="D6DEE8"/>
+              <w:left w:val="single" w:sz="6" w:space="0" w:color="D6DEE8"/>
+              <w:bottom w:val="single" w:sz="6" w:space="0" w:color="D6DEE8"/>
+              <w:right w:val="single" w:sz="6" w:space="0" w:color="D6DEE8"/>
+            </w:tcBorders>
+            <w:tcMar>
+              <w:top w:w="150" w:type="dxa"/>
+              <w:start w:w="120" w:type="dxa"/>
+              <w:bottom w:w="150" w:type="dxa"/>
+              <w:end w:w="120" w:type="dxa"/>
+            </w:tcMar>
+          </w:tcPr>
+          <w:p>
+            <w:r>
+              <w:rPr>
+                <w:b/>
+                <w:color w:val="003366"/>
+                <w:sz w:val="21"/>
+              </w:rPr>
+              <w:t>Dinsdag</w:t>
+            </w:r>
+          </w:p>
+          <w:p>
+            <w:r>
+              <w:rPr>
+                <w:b w:val="0"/>
+                <w:color w:val="475569"/>
+                <w:sz w:val="18"/>
+              </w:rPr>
+              <w:t>28 april</w:t>
+            </w:r>
+          </w:p>
+        </w:tc>
+        <w:tc>
+          <w:tcPr>
+            <w:tcW w:type="dxa" w:w="2833"/>
+            <w:shd w:fill="16A34A"/>
+            <w:tcBorders>
+              <w:top w:val="single" w:sz="8" w:space="0" w:color="D6DEE8"/>
+              <w:left w:val="single" w:sz="8" w:space="0" w:color="D6DEE8"/>
+              <w:bottom w:val="single" w:sz="8" w:space="0" w:color="D6DEE8"/>
+              <w:right w:val="single" w:sz="8" w:space="0" w:color="D6DEE8"/>
+            </w:tcBorders>
+            <w:tcMar>
+              <w:top w:w="150" w:type="dxa"/>
+              <w:start w:w="120" w:type="dxa"/>
+              <w:bottom w:w="150" w:type="dxa"/>
+              <w:end w:w="120" w:type="dxa"/>
+            </w:tcMar>
+          </w:tcPr>
+          <w:p>
+            <w:r>
+              <w:rPr>
+                <w:b/>
+                <w:color w:val="FFFFFF"/>
+                <w:sz w:val="30"/>
+              </w:rPr>
+              <w:t>↗  NO</w:t>
+            </w:r>
+          </w:p>
+          <w:p>
+            <w:r>
+              <w:rPr>
+                <w:b/>
+                <w:color w:val="FFFFFF"/>
+                <w:sz w:val="26"/>
+              </w:rPr>
+              <w:t>Bft 3</w:t>
+            </w:r>
+          </w:p>
+          <w:p>
+            <w:r>
+              <w:rPr>
+                <w:b w:val="0"/>
+                <w:color w:val="FFFFFF"/>
+                <w:sz w:val="19"/>
+              </w:rPr>
+              <w:t>18 km/u wind</w:t>
+            </w:r>
+          </w:p>
+          <w:p>
+            <w:r>
+              <w:rPr>
+                <w:b w:val="0"/>
+                <w:color w:val="FFFFFF"/>
+                <w:sz w:val="19"/>
+              </w:rPr>
+              <w:t>stoten 32 km/u</w:t>
+            </w:r>
+          </w:p>
+        </w:tc>
+        <w:tc>
+          <w:tcPr>
+            <w:tcW w:type="dxa" w:w="2833"/>
+            <w:shd w:fill="FACC15"/>
+            <w:tcBorders>
+              <w:top w:val="single" w:sz="8" w:space="0" w:color="D6DEE8"/>
+              <w:left w:val="single" w:sz="8" w:space="0" w:color="D6DEE8"/>
+              <w:bottom w:val="single" w:sz="8" w:space="0" w:color="D6DEE8"/>
+              <w:right w:val="single" w:sz="8" w:space="0" w:color="D6DEE8"/>
+            </w:tcBorders>
+            <w:tcMar>
+              <w:top w:w="150" w:type="dxa"/>
+              <w:start w:w="120" w:type="dxa"/>
+              <w:bottom w:w="150" w:type="dxa"/>
+              <w:end w:w="120" w:type="dxa"/>
+            </w:tcMar>
+          </w:tcPr>
+          <w:p>
+            <w:r>
+              <w:rPr>
+                <w:b/>
+                <w:color w:val="111827"/>
+                <w:sz w:val="30"/>
+              </w:rPr>
+              <w:t>↗  NO</w:t>
+            </w:r>
+          </w:p>
+          <w:p>
+            <w:r>
+              <w:rPr>
+                <w:b/>
+                <w:color w:val="111827"/>
+                <w:sz w:val="26"/>
+              </w:rPr>
+              <w:t>Bft 4</w:t>
+            </w:r>
+          </w:p>
+          <w:p>
+            <w:r>
+              <w:rPr>
+                <w:b w:val="0"/>
+                <w:color w:val="111827"/>
+                <w:sz w:val="19"/>
+              </w:rPr>
+              <w:t>28 km/u wind</w:t>
+            </w:r>
+          </w:p>
+          <w:p>
+            <w:r>
+              <w:rPr>
+                <w:b w:val="0"/>
+                <w:color w:val="111827"/>
+                <w:sz w:val="19"/>
+              </w:rPr>
+              <w:t>stoten 43 km/u</w:t>
+            </w:r>
+          </w:p>
+        </w:tc>
+        <w:tc>
+          <w:tcPr>
+            <w:tcW w:type="dxa" w:w="2833"/>
+            <w:shd w:fill="FACC15"/>
+            <w:tcBorders>
+              <w:top w:val="single" w:sz="8" w:space="0" w:color="D6DEE8"/>
+              <w:left w:val="single" w:sz="8" w:space="0" w:color="D6DEE8"/>
+              <w:bottom w:val="single" w:sz="8" w:space="0" w:color="D6DEE8"/>
+              <w:right w:val="single" w:sz="8" w:space="0" w:color="D6DEE8"/>
+            </w:tcBorders>
+            <w:tcMar>
+              <w:top w:w="150" w:type="dxa"/>
+              <w:start w:w="120" w:type="dxa"/>
+              <w:bottom w:w="150" w:type="dxa"/>
+              <w:end w:w="120" w:type="dxa"/>
+            </w:tcMar>
+          </w:tcPr>
+          <w:p>
+            <w:r>
+              <w:rPr>
+                <w:b/>
+                <w:color w:val="111827"/>
+                <w:sz w:val="30"/>
+              </w:rPr>
+              <w:t>↗  NO</w:t>
+            </w:r>
+          </w:p>
+          <w:p>
+            <w:r>
+              <w:rPr>
+                <w:b/>
+                <w:color w:val="111827"/>
+                <w:sz w:val="26"/>
+              </w:rPr>
+              <w:t>Bft 4</w:t>
+            </w:r>
+          </w:p>
+          <w:p>
+            <w:r>
+              <w:rPr>
+                <w:b w:val="0"/>
+                <w:color w:val="111827"/>
+                <w:sz w:val="19"/>
+              </w:rPr>
+              <w:t>22 km/u wind</w:t>
+            </w:r>
+          </w:p>
+          <w:p>
+            <w:r>
+              <w:rPr>
+                <w:b w:val="0"/>
+                <w:color w:val="111827"/>
+                <w:sz w:val="19"/>
+              </w:rPr>
+              <w:t>stoten 37 km/u</w:t>
+            </w:r>
+          </w:p>
+        </w:tc>
+      </w:tr>
+      <w:tr>
+        <w:tc>
+          <w:tcPr>
+            <w:tcW w:type="dxa" w:w="2833"/>
+            <w:shd w:fill="EAF3FF"/>
+            <w:tcBorders>
+              <w:top w:val="single" w:sz="6" w:space="0" w:color="D6DEE8"/>
+              <w:left w:val="single" w:sz="6" w:space="0" w:color="D6DEE8"/>
+              <w:bottom w:val="single" w:sz="6" w:space="0" w:color="D6DEE8"/>
+              <w:right w:val="single" w:sz="6" w:space="0" w:color="D6DEE8"/>
+            </w:tcBorders>
+            <w:tcMar>
+              <w:top w:w="150" w:type="dxa"/>
+              <w:start w:w="120" w:type="dxa"/>
+              <w:bottom w:w="150" w:type="dxa"/>
+              <w:end w:w="120" w:type="dxa"/>
+            </w:tcMar>
+          </w:tcPr>
+          <w:p>
+            <w:r>
+              <w:rPr>
+                <w:b/>
+                <w:color w:val="003366"/>
+                <w:sz w:val="21"/>
+              </w:rPr>
+              <w:t>Woensdag</w:t>
+            </w:r>
+          </w:p>
+          <w:p>
+            <w:r>
+              <w:rPr>
+                <w:b w:val="0"/>
+                <w:color w:val="475569"/>
+                <w:sz w:val="18"/>
+              </w:rPr>
+              <w:t>29 april</w:t>
+            </w:r>
+          </w:p>
+        </w:tc>
+        <w:tc>
+          <w:tcPr>
+            <w:tcW w:type="dxa" w:w="2833"/>
+            <w:shd w:fill="FACC15"/>
+            <w:tcBorders>
+              <w:top w:val="single" w:sz="8" w:space="0" w:color="D6DEE8"/>
+              <w:left w:val="single" w:sz="8" w:space="0" w:color="D6DEE8"/>
+              <w:bottom w:val="single" w:sz="8" w:space="0" w:color="D6DEE8"/>
+              <w:right w:val="single" w:sz="8" w:space="0" w:color="D6DEE8"/>
+            </w:tcBorders>
+            <w:tcMar>
+              <w:top w:w="150" w:type="dxa"/>
+              <w:start w:w="120" w:type="dxa"/>
+              <w:bottom w:w="150" w:type="dxa"/>
+              <w:end w:w="120" w:type="dxa"/>
+            </w:tcMar>
+          </w:tcPr>
+          <w:p>
+            <w:r>
+              <w:rPr>
+                <w:b/>
+                <w:color w:val="111827"/>
+                <w:sz w:val="30"/>
+              </w:rPr>
+              <w:t>↗  ONO</w:t>
+            </w:r>
+          </w:p>
+          <w:p>
+            <w:r>
+              <w:rPr>
+                <w:b/>
+                <w:color w:val="111827"/>
+                <w:sz w:val="26"/>
+              </w:rPr>
+              <w:t>Bft 4</w:t>
+            </w:r>
+          </w:p>
+          <w:p>
+            <w:r>
+              <w:rPr>
+                <w:b w:val="0"/>
+                <w:color w:val="111827"/>
+                <w:sz w:val="19"/>
+              </w:rPr>
+              <w:t>22 km/u wind</w:t>
+            </w:r>
+          </w:p>
+          <w:p>
+            <w:r>
+              <w:rPr>
+                <w:b w:val="0"/>
+                <w:color w:val="111827"/>
+                <w:sz w:val="19"/>
+              </w:rPr>
+              <w:t>stoten 33 km/u</w:t>
+            </w:r>
+          </w:p>
+        </w:tc>
+        <w:tc>
+          <w:tcPr>
+            <w:tcW w:type="dxa" w:w="2833"/>
+            <w:shd w:fill="F97316"/>
+            <w:tcBorders>
+              <w:top w:val="single" w:sz="8" w:space="0" w:color="D6DEE8"/>
+              <w:left w:val="single" w:sz="8" w:space="0" w:color="D6DEE8"/>
+              <w:bottom w:val="single" w:sz="8" w:space="0" w:color="D6DEE8"/>
+              <w:right w:val="single" w:sz="8" w:space="0" w:color="D6DEE8"/>
+            </w:tcBorders>
+            <w:tcMar>
+              <w:top w:w="150" w:type="dxa"/>
+              <w:start w:w="120" w:type="dxa"/>
+              <w:bottom w:w="150" w:type="dxa"/>
+              <w:end w:w="120" w:type="dxa"/>
+            </w:tcMar>
+          </w:tcPr>
+          <w:p>
+            <w:r>
+              <w:rPr>
+                <w:b/>
+                <w:color w:val="FFFFFF"/>
+                <w:sz w:val="30"/>
+              </w:rPr>
+              <w:t>→  ONO</w:t>
+            </w:r>
+          </w:p>
+          <w:p>
+            <w:r>
+              <w:rPr>
+                <w:b/>
+                <w:color w:val="FFFFFF"/>
+                <w:sz w:val="26"/>
+              </w:rPr>
+              <w:t>Bft 5</w:t>
+            </w:r>
+          </w:p>
+          <w:p>
+            <w:r>
+              <w:rPr>
+                <w:b w:val="0"/>
+                <w:color w:val="FFFFFF"/>
+                <w:sz w:val="19"/>
+              </w:rPr>
+              <w:t>30 km/u wind</w:t>
+            </w:r>
+          </w:p>
+          <w:p>
+            <w:r>
+              <w:rPr>
+                <w:b w:val="0"/>
+                <w:color w:val="FFFFFF"/>
+                <w:sz w:val="19"/>
+              </w:rPr>
+              <w:t>stoten 46 km/u</w:t>
+            </w:r>
+          </w:p>
+        </w:tc>
+        <w:tc>
+          <w:tcPr>
+            <w:tcW w:type="dxa" w:w="2833"/>
+            <w:shd w:fill="FACC15"/>
+            <w:tcBorders>
+              <w:top w:val="single" w:sz="8" w:space="0" w:color="D6DEE8"/>
+              <w:left w:val="single" w:sz="8" w:space="0" w:color="D6DEE8"/>
+              <w:bottom w:val="single" w:sz="8" w:space="0" w:color="D6DEE8"/>
+              <w:right w:val="single" w:sz="8" w:space="0" w:color="D6DEE8"/>
+            </w:tcBorders>
+            <w:tcMar>
+              <w:top w:w="150" w:type="dxa"/>
+              <w:start w:w="120" w:type="dxa"/>
+              <w:bottom w:w="150" w:type="dxa"/>
+              <w:end w:w="120" w:type="dxa"/>
+            </w:tcMar>
+          </w:tcPr>
+          <w:p>
+            <w:r>
+              <w:rPr>
+                <w:b/>
+                <w:color w:val="111827"/>
+                <w:sz w:val="30"/>
+              </w:rPr>
+              <w:t>↗  ONO</w:t>
+            </w:r>
+          </w:p>
+          <w:p>
+            <w:r>
+              <w:rPr>
+                <w:b/>
+                <w:color w:val="111827"/>
+                <w:sz w:val="26"/>
+              </w:rPr>
+              <w:t>Bft 4</w:t>
+            </w:r>
+          </w:p>
+          <w:p>
+            <w:r>
+              <w:rPr>
+                <w:b w:val="0"/>
+                <w:color w:val="111827"/>
+                <w:sz w:val="19"/>
+              </w:rPr>
+              <w:t>22 km/u wind</w:t>
+            </w:r>
+          </w:p>
+          <w:p>
+            <w:r>
+              <w:rPr>
+                <w:b w:val="0"/>
+                <w:color w:val="111827"/>
+                <w:sz w:val="19"/>
+              </w:rPr>
+              <w:t>stoten 39 km/u</w:t>
+            </w:r>
+          </w:p>
+        </w:tc>
+      </w:tr>
+      <w:tr>
+        <w:tc>
+          <w:tcPr>
+            <w:tcW w:type="dxa" w:w="2833"/>
+            <w:shd w:fill="F8FBFF"/>
+            <w:tcBorders>
+              <w:top w:val="single" w:sz="6" w:space="0" w:color="D6DEE8"/>
+              <w:left w:val="single" w:sz="6" w:space="0" w:color="D6DEE8"/>
+              <w:bottom w:val="single" w:sz="6" w:space="0" w:color="D6DEE8"/>
+              <w:right w:val="single" w:sz="6" w:space="0" w:color="D6DEE8"/>
+            </w:tcBorders>
+            <w:tcMar>
+              <w:top w:w="150" w:type="dxa"/>
+              <w:start w:w="120" w:type="dxa"/>
+              <w:bottom w:w="150" w:type="dxa"/>
+              <w:end w:w="120" w:type="dxa"/>
+            </w:tcMar>
+          </w:tcPr>
+          <w:p>
+            <w:r>
+              <w:rPr>
+                <w:b/>
+                <w:color w:val="003366"/>
+                <w:sz w:val="21"/>
+              </w:rPr>
+              <w:t>Donderdag</w:t>
+            </w:r>
+          </w:p>
+          <w:p>
+            <w:r>
+              <w:rPr>
+                <w:b w:val="0"/>
+                <w:color w:val="475569"/>
+                <w:sz w:val="18"/>
+              </w:rPr>
+              <w:t>30 april</w:t>
+            </w:r>
+          </w:p>
+        </w:tc>
+        <w:tc>
+          <w:tcPr>
+            <w:tcW w:type="dxa" w:w="2833"/>
+            <w:shd w:fill="FACC15"/>
+            <w:tcBorders>
+              <w:top w:val="single" w:sz="8" w:space="0" w:color="D6DEE8"/>
+              <w:left w:val="single" w:sz="8" w:space="0" w:color="D6DEE8"/>
+              <w:bottom w:val="single" w:sz="8" w:space="0" w:color="D6DEE8"/>
+              <w:right w:val="single" w:sz="8" w:space="0" w:color="D6DEE8"/>
+            </w:tcBorders>
+            <w:tcMar>
+              <w:top w:w="150" w:type="dxa"/>
+              <w:start w:w="120" w:type="dxa"/>
+              <w:bottom w:w="150" w:type="dxa"/>
+              <w:end w:w="120" w:type="dxa"/>
+            </w:tcMar>
+          </w:tcPr>
+          <w:p>
+            <w:r>
+              <w:rPr>
+                <w:b/>
+                <w:color w:val="111827"/>
+                <w:sz w:val="30"/>
+              </w:rPr>
+              <w:t>→  O</w:t>
+            </w:r>
+          </w:p>
+          <w:p>
+            <w:r>
+              <w:rPr>
+                <w:b/>
+                <w:color w:val="111827"/>
+                <w:sz w:val="26"/>
+              </w:rPr>
+              <w:t>Bft 4</w:t>
+            </w:r>
+          </w:p>
+          <w:p>
+            <w:r>
+              <w:rPr>
+                <w:b w:val="0"/>
+                <w:color w:val="111827"/>
+                <w:sz w:val="19"/>
+              </w:rPr>
+              <w:t>20 km/u wind</w:t>
+            </w:r>
+          </w:p>
+          <w:p>
+            <w:r>
+              <w:rPr>
+                <w:b w:val="0"/>
+                <w:color w:val="111827"/>
+                <w:sz w:val="19"/>
+              </w:rPr>
+              <w:t>stoten 32 km/u</w:t>
+            </w:r>
+          </w:p>
+        </w:tc>
+        <w:tc>
+          <w:tcPr>
+            <w:tcW w:type="dxa" w:w="2833"/>
+            <w:shd w:fill="FACC15"/>
+            <w:tcBorders>
+              <w:top w:val="single" w:sz="8" w:space="0" w:color="D6DEE8"/>
+              <w:left w:val="single" w:sz="8" w:space="0" w:color="D6DEE8"/>
+              <w:bottom w:val="single" w:sz="8" w:space="0" w:color="D6DEE8"/>
+              <w:right w:val="single" w:sz="8" w:space="0" w:color="D6DEE8"/>
+            </w:tcBorders>
+            <w:tcMar>
+              <w:top w:w="150" w:type="dxa"/>
+              <w:start w:w="120" w:type="dxa"/>
+              <w:bottom w:w="150" w:type="dxa"/>
+              <w:end w:w="120" w:type="dxa"/>
+            </w:tcMar>
+          </w:tcPr>
+          <w:p>
+            <w:r>
+              <w:rPr>
+                <w:b/>
+                <w:color w:val="111827"/>
+                <w:sz w:val="30"/>
+              </w:rPr>
+              <w:t>→  O</w:t>
+            </w:r>
+          </w:p>
+          <w:p>
+            <w:r>
+              <w:rPr>
+                <w:b/>
+                <w:color w:val="111827"/>
+                <w:sz w:val="26"/>
+              </w:rPr>
+              <w:t>Bft 4</w:t>
+            </w:r>
+          </w:p>
+          <w:p>
+            <w:r>
+              <w:rPr>
+                <w:b w:val="0"/>
+                <w:color w:val="111827"/>
+                <w:sz w:val="19"/>
+              </w:rPr>
+              <w:t>28 km/u wind</w:t>
+            </w:r>
+          </w:p>
+          <w:p>
+            <w:r>
+              <w:rPr>
+                <w:b w:val="0"/>
+                <w:color w:val="111827"/>
+                <w:sz w:val="19"/>
+              </w:rPr>
+              <w:t>stoten 44 km/u</w:t>
+            </w:r>
+          </w:p>
+        </w:tc>
+        <w:tc>
+          <w:tcPr>
+            <w:tcW w:type="dxa" w:w="2833"/>
+            <w:shd w:fill="FACC15"/>
+            <w:tcBorders>
+              <w:top w:val="single" w:sz="8" w:space="0" w:color="D6DEE8"/>
+              <w:left w:val="single" w:sz="8" w:space="0" w:color="D6DEE8"/>
+              <w:bottom w:val="single" w:sz="8" w:space="0" w:color="D6DEE8"/>
+              <w:right w:val="single" w:sz="8" w:space="0" w:color="D6DEE8"/>
+            </w:tcBorders>
+            <w:tcMar>
+              <w:top w:w="150" w:type="dxa"/>
+              <w:start w:w="120" w:type="dxa"/>
+              <w:bottom w:w="150" w:type="dxa"/>
+              <w:end w:w="120" w:type="dxa"/>
+            </w:tcMar>
+          </w:tcPr>
+          <w:p>
+            <w:r>
+              <w:rPr>
+                <w:b/>
+                <w:color w:val="111827"/>
+                <w:sz w:val="30"/>
+              </w:rPr>
+              <w:t>→  O</w:t>
+            </w:r>
+          </w:p>
+          <w:p>
+            <w:r>
+              <w:rPr>
+                <w:b/>
+                <w:color w:val="111827"/>
+                <w:sz w:val="26"/>
+              </w:rPr>
+              <w:t>Bft 4</w:t>
+            </w:r>
+          </w:p>
+          <w:p>
+            <w:r>
+              <w:rPr>
+                <w:b w:val="0"/>
+                <w:color w:val="111827"/>
+                <w:sz w:val="19"/>
+              </w:rPr>
+              <w:t>22 km/u wind</w:t>
+            </w:r>
+          </w:p>
+          <w:p>
+            <w:r>
+              <w:rPr>
+                <w:b w:val="0"/>
+                <w:color w:val="111827"/>
+                <w:sz w:val="19"/>
+              </w:rPr>
+              <w:t>stoten 37 km/u</w:t>
+            </w:r>
+          </w:p>
+        </w:tc>
+      </w:tr>
+      <w:tr>
+        <w:tc>
+          <w:tcPr>
+            <w:tcW w:type="dxa" w:w="2833"/>
+            <w:shd w:fill="EAF3FF"/>
+            <w:tcBorders>
+              <w:top w:val="single" w:sz="6" w:space="0" w:color="D6DEE8"/>
+              <w:left w:val="single" w:sz="6" w:space="0" w:color="D6DEE8"/>
+              <w:bottom w:val="single" w:sz="6" w:space="0" w:color="D6DEE8"/>
+              <w:right w:val="single" w:sz="6" w:space="0" w:color="D6DEE8"/>
+            </w:tcBorders>
+            <w:tcMar>
+              <w:top w:w="150" w:type="dxa"/>
+              <w:start w:w="120" w:type="dxa"/>
+              <w:bottom w:w="150" w:type="dxa"/>
+              <w:end w:w="120" w:type="dxa"/>
+            </w:tcMar>
+          </w:tcPr>
+          <w:p>
+            <w:r>
+              <w:rPr>
+                <w:b/>
+                <w:color w:val="003366"/>
+                <w:sz w:val="21"/>
+              </w:rPr>
+              <w:t>Vrijdag</w:t>
+            </w:r>
+          </w:p>
+          <w:p>
+            <w:r>
+              <w:rPr>
+                <w:b w:val="0"/>
+                <w:color w:val="475569"/>
+                <w:sz w:val="18"/>
+              </w:rPr>
+              <w:t>1 mei</w:t>
+            </w:r>
+          </w:p>
+        </w:tc>
+        <w:tc>
+          <w:tcPr>
+            <w:tcW w:type="dxa" w:w="2833"/>
+            <w:shd w:fill="16A34A"/>
+            <w:tcBorders>
+              <w:top w:val="single" w:sz="8" w:space="0" w:color="D6DEE8"/>
+              <w:left w:val="single" w:sz="8" w:space="0" w:color="D6DEE8"/>
+              <w:bottom w:val="single" w:sz="8" w:space="0" w:color="D6DEE8"/>
+              <w:right w:val="single" w:sz="8" w:space="0" w:color="D6DEE8"/>
+            </w:tcBorders>
+            <w:tcMar>
+              <w:top w:w="150" w:type="dxa"/>
+              <w:start w:w="120" w:type="dxa"/>
+              <w:bottom w:w="150" w:type="dxa"/>
+              <w:end w:w="120" w:type="dxa"/>
+            </w:tcMar>
+          </w:tcPr>
+          <w:p>
+            <w:r>
+              <w:rPr>
+                <w:b/>
+                <w:color w:val="FFFFFF"/>
+                <w:sz w:val="30"/>
+              </w:rPr>
+              <w:t>→  OZO</w:t>
+            </w:r>
+          </w:p>
+          <w:p>
+            <w:r>
+              <w:rPr>
+                <w:b/>
+                <w:color w:val="FFFFFF"/>
+                <w:sz w:val="26"/>
+              </w:rPr>
+              <w:t>Bft 3</w:t>
+            </w:r>
+          </w:p>
+          <w:p>
+            <w:r>
+              <w:rPr>
+                <w:b w:val="0"/>
+                <w:color w:val="FFFFFF"/>
+                <w:sz w:val="19"/>
+              </w:rPr>
+              <w:t>18 km/u wind</w:t>
+            </w:r>
+          </w:p>
+          <w:p>
+            <w:r>
+              <w:rPr>
+                <w:b w:val="0"/>
+                <w:color w:val="FFFFFF"/>
+                <w:sz w:val="19"/>
+              </w:rPr>
+              <w:t>stoten 28 km/u</w:t>
+            </w:r>
+          </w:p>
+        </w:tc>
+        <w:tc>
+          <w:tcPr>
+            <w:tcW w:type="dxa" w:w="2833"/>
+            <w:shd w:fill="FACC15"/>
+            <w:tcBorders>
+              <w:top w:val="single" w:sz="8" w:space="0" w:color="D6DEE8"/>
+              <w:left w:val="single" w:sz="8" w:space="0" w:color="D6DEE8"/>
+              <w:bottom w:val="single" w:sz="8" w:space="0" w:color="D6DEE8"/>
+              <w:right w:val="single" w:sz="8" w:space="0" w:color="D6DEE8"/>
+            </w:tcBorders>
+            <w:tcMar>
+              <w:top w:w="150" w:type="dxa"/>
+              <w:start w:w="120" w:type="dxa"/>
+              <w:bottom w:w="150" w:type="dxa"/>
+              <w:end w:w="120" w:type="dxa"/>
+            </w:tcMar>
+          </w:tcPr>
+          <w:p>
+            <w:r>
+              <w:rPr>
+                <w:b/>
+                <w:color w:val="111827"/>
+                <w:sz w:val="30"/>
+              </w:rPr>
+              <w:t>↘  ZO</w:t>
+            </w:r>
+          </w:p>
+          <w:p>
+            <w:r>
+              <w:rPr>
+                <w:b/>
+                <w:color w:val="111827"/>
+                <w:sz w:val="26"/>
+              </w:rPr>
+              <w:t>Bft 4</w:t>
+            </w:r>
+          </w:p>
+          <w:p>
+            <w:r>
+              <w:rPr>
+                <w:b w:val="0"/>
+                <w:color w:val="111827"/>
+                <w:sz w:val="19"/>
+              </w:rPr>
+              <w:t>22 km/u wind</w:t>
+            </w:r>
+          </w:p>
+          <w:p>
+            <w:r>
+              <w:rPr>
+                <w:b w:val="0"/>
+                <w:color w:val="111827"/>
+                <w:sz w:val="19"/>
+              </w:rPr>
+              <w:t>stoten 37 km/u</w:t>
+            </w:r>
+          </w:p>
+        </w:tc>
+        <w:tc>
+          <w:tcPr>
+            <w:tcW w:type="dxa" w:w="2833"/>
+            <w:shd w:fill="16A34A"/>
+            <w:tcBorders>
+              <w:top w:val="single" w:sz="8" w:space="0" w:color="D6DEE8"/>
+              <w:left w:val="single" w:sz="8" w:space="0" w:color="D6DEE8"/>
+              <w:bottom w:val="single" w:sz="8" w:space="0" w:color="D6DEE8"/>
+              <w:right w:val="single" w:sz="8" w:space="0" w:color="D6DEE8"/>
+            </w:tcBorders>
+            <w:tcMar>
+              <w:top w:w="150" w:type="dxa"/>
+              <w:start w:w="120" w:type="dxa"/>
+              <w:bottom w:w="150" w:type="dxa"/>
+              <w:end w:w="120" w:type="dxa"/>
+            </w:tcMar>
+          </w:tcPr>
+          <w:p>
+            <w:r>
+              <w:rPr>
+                <w:b/>
+                <w:color w:val="FFFFFF"/>
+                <w:sz w:val="30"/>
+              </w:rPr>
+              <w:t>↘  ZO</w:t>
+            </w:r>
+          </w:p>
+          <w:p>
+            <w:r>
+              <w:rPr>
+                <w:b/>
+                <w:color w:val="FFFFFF"/>
+                <w:sz w:val="26"/>
+              </w:rPr>
+              <w:t>Bft 3</w:t>
+            </w:r>
+          </w:p>
+          <w:p>
+            <w:r>
+              <w:rPr>
+                <w:b w:val="0"/>
+                <w:color w:val="FFFFFF"/>
+                <w:sz w:val="19"/>
+              </w:rPr>
+              <w:t>13 km/u wind</w:t>
+            </w:r>
+          </w:p>
+          <w:p>
+            <w:r>
+              <w:rPr>
+                <w:b w:val="0"/>
+                <w:color w:val="FFFFFF"/>
+                <w:sz w:val="19"/>
+              </w:rPr>
+              <w:t>stoten 22 km/u</w:t>
+            </w:r>
+          </w:p>
+        </w:tc>
+      </w:tr>
+    </w:tbl>
     <w:sectPr>
-      <w:pgSz w:w="16834" w:h="11909" w:orient="landscape"/>
-      <w:pgMar w:top="85" w:right="85" w:bottom="85" w:left="85" w:header="720" w:footer="720" w:gutter="0"/>
+      <w:footerReference w:type="default" r:id="rId10"/>
+      <w:pgSz w:w="12240" w:h="15840"/>
+      <w:pgMar w:top="454" w:right="454" w:bottom="454" w:left="454" w:header="720" w:footer="720" w:gutter="0"/>
       <w:cols w:space="720"/>
       <w:docGrid w:linePitch="360"/>
     </w:sectPr>
   </w:body>
 </w:document>
+</file>
+
+<file path=word/footer1.xml><?xml version="1.0" encoding="utf-8"?>
+<w:ftr xmlns:m="http://schemas.openxmlformats.org/officeDocument/2006/math" xmlns:mc="http://schemas.openxmlformats.org/markup-compatibility/2006" xmlns:mo="http://schemas.microsoft.com/office/mac/office/2008/main" xmlns:mv="urn:schemas-microsoft-com:mac:vml" xmlns:o="urn:schemas-microsoft-com:office:office" xmlns:r="http://schemas.openxmlformats.org/officeDocument/2006/relationships" xmlns:v="urn:schemas-microsoft-com:vml" xmlns:w10="urn:schemas-microsoft-com:office:word" xmlns:w14="http://schemas.microsoft.com/office/word/2010/wordml" xmlns:w="http://schemas.openxmlformats.org/wordprocessingml/2006/main" xmlns:wne="http://schemas.microsoft.com/office/word/2006/wordml" xmlns:wp14="http://schemas.microsoft.com/office/word/2010/wordprocessingDrawing" xmlns:wp="http://schemas.openxmlformats.org/drawingml/2006/wordprocessingDrawing" xmlns:wpc="http://schemas.microsoft.com/office/word/2010/wordprocessingCanvas" xmlns:wpg="http://schemas.microsoft.com/office/word/2010/wordprocessingGroup" xmlns:wpi="http://schemas.microsoft.com/office/word/2010/wordprocessingInk" xmlns:wps="http://schemas.microsoft.com/office/word/2010/wordprocessingShape" mc:Ignorable="w14 wp14">
+  <w:p>
+    <w:pPr>
+      <w:pStyle w:val="Footer"/>
+      <w:jc w:val="center"/>
+    </w:pPr>
+    <w:r>
+      <w:rPr>
+        <w:b w:val="0"/>
+        <w:color w:val="64748B"/>
+        <w:sz w:val="16"/>
+      </w:rPr>
+      <w:t>© Ed Aldus Weer en Media</w:t>
+    </w:r>
+  </w:p>
+</w:ftr>
 </file>
 
 <file path=word/numbering.xml><?xml version="1.0" encoding="utf-8"?>
@@ -417,7 +1732,7 @@
     <w:rsid w:val="00FC693F"/>
     <w:rPr>
       <w:rFonts w:ascii="Arial" w:hAnsi="Arial"/>
-      <w:sz w:val="19"/>
+      <w:sz w:val="18"/>
     </w:rPr>
   </w:style>
   <w:style w:type="paragraph" w:styleId="Header">

</xml_diff>

<commit_message>
Maak vlaggenweer bewerkbaar en corrigeer windpijlen
</commit_message>
<xml_diff>
--- a/VLAGGENWEER.docx
+++ b/VLAGGENWEER.docx
@@ -80,7 +80,7 @@
           <w:color w:val="003366"/>
           <w:sz w:val="20"/>
         </w:rPr>
-        <w:t>Maandag 27 april 2026 | 07:16 uur</w:t>
+        <w:t>Maandag 27 april 2026 | 07:36 uur</w:t>
       </w:r>
     </w:p>
     <w:tbl>
@@ -329,7 +329,7 @@
                 <w:color w:val="FFFFFF"/>
                 <w:sz w:val="30"/>
               </w:rPr>
-              <w:t>↗  ONO</w:t>
+              <w:t>↙  ONO</w:t>
             </w:r>
           </w:p>
           <w:p>
@@ -387,7 +387,7 @@
                 <w:color w:val="FFFFFF"/>
                 <w:sz w:val="30"/>
               </w:rPr>
-              <w:t>↗  NO</w:t>
+              <w:t>↙  NO</w:t>
             </w:r>
           </w:p>
           <w:p>
@@ -445,7 +445,7 @@
                 <w:color w:val="FFFFFF"/>
                 <w:sz w:val="30"/>
               </w:rPr>
-              <w:t>↗  NO</w:t>
+              <w:t>↙  NO</w:t>
             </w:r>
           </w:p>
           <w:p>
@@ -543,7 +543,7 @@
                 <w:color w:val="FFFFFF"/>
                 <w:sz w:val="30"/>
               </w:rPr>
-              <w:t>↗  NO</w:t>
+              <w:t>↙  NO</w:t>
             </w:r>
           </w:p>
           <w:p>
@@ -601,7 +601,7 @@
                 <w:color w:val="111827"/>
                 <w:sz w:val="30"/>
               </w:rPr>
-              <w:t>↗  NO</w:t>
+              <w:t>↙  NO</w:t>
             </w:r>
           </w:p>
           <w:p>
@@ -659,7 +659,7 @@
                 <w:color w:val="111827"/>
                 <w:sz w:val="30"/>
               </w:rPr>
-              <w:t>↗  NO</w:t>
+              <w:t>↙  NO</w:t>
             </w:r>
           </w:p>
           <w:p>
@@ -757,7 +757,7 @@
                 <w:color w:val="111827"/>
                 <w:sz w:val="30"/>
               </w:rPr>
-              <w:t>↗  ONO</w:t>
+              <w:t>↙  ONO</w:t>
             </w:r>
           </w:p>
           <w:p>
@@ -815,7 +815,7 @@
                 <w:color w:val="FFFFFF"/>
                 <w:sz w:val="30"/>
               </w:rPr>
-              <w:t>→  ONO</w:t>
+              <w:t>←  ONO</w:t>
             </w:r>
           </w:p>
           <w:p>
@@ -873,7 +873,7 @@
                 <w:color w:val="111827"/>
                 <w:sz w:val="30"/>
               </w:rPr>
-              <w:t>↗  ONO</w:t>
+              <w:t>↙  ONO</w:t>
             </w:r>
           </w:p>
           <w:p>
@@ -971,7 +971,7 @@
                 <w:color w:val="111827"/>
                 <w:sz w:val="30"/>
               </w:rPr>
-              <w:t>→  O</w:t>
+              <w:t>←  O</w:t>
             </w:r>
           </w:p>
           <w:p>
@@ -1029,7 +1029,7 @@
                 <w:color w:val="111827"/>
                 <w:sz w:val="30"/>
               </w:rPr>
-              <w:t>→  O</w:t>
+              <w:t>←  O</w:t>
             </w:r>
           </w:p>
           <w:p>
@@ -1087,7 +1087,7 @@
                 <w:color w:val="111827"/>
                 <w:sz w:val="30"/>
               </w:rPr>
-              <w:t>→  O</w:t>
+              <w:t>←  O</w:t>
             </w:r>
           </w:p>
           <w:p>
@@ -1185,7 +1185,7 @@
                 <w:color w:val="FFFFFF"/>
                 <w:sz w:val="30"/>
               </w:rPr>
-              <w:t>→  OZO</w:t>
+              <w:t>←  OZO</w:t>
             </w:r>
           </w:p>
           <w:p>
@@ -1243,7 +1243,7 @@
                 <w:color w:val="111827"/>
                 <w:sz w:val="30"/>
               </w:rPr>
-              <w:t>↘  ZO</w:t>
+              <w:t>↖  ZO</w:t>
             </w:r>
           </w:p>
           <w:p>
@@ -1301,7 +1301,7 @@
                 <w:color w:val="FFFFFF"/>
                 <w:sz w:val="30"/>
               </w:rPr>
-              <w:t>↘  ZO</w:t>
+              <w:t>↖  ZO</w:t>
             </w:r>
           </w:p>
           <w:p>
@@ -1362,6 +1362,17 @@
         <w:sz w:val="16"/>
       </w:rPr>
       <w:t>© Ed Aldus Weer en Media</w:t>
+    </w:r>
+    <w:r>
+      <w:br/>
+    </w:r>
+    <w:r>
+      <w:rPr>
+        <w:b w:val="0"/>
+        <w:color w:val="64748B"/>
+        <w:sz w:val="14"/>
+      </w:rPr>
+      <w:t>© Ed Aldus Weer en Media aanvaardt geen aansprakelijkheid voor het niet of slechts ten-dele uitkomen van de verstrekte verwachtingen.</w:t>
     </w:r>
   </w:p>
 </w:ftr>

</xml_diff>